<commit_message>
Geschichte 8: Zeitstrahl unten auf dem Textblatt, Expertentexte gestrichen
Co-Authored-By: Claude Sonnet 5.5 <noreply@anthropic.com>
Claude-Session: https://claude.ai/code/session_01CtRuNVyt8v9M882BKEmgNb
</commit_message>
<xml_diff>
--- a/Geschichte_8/Generalstaende_Stunde1/Tafelskript_Generalstaende_Stunde1.docx
+++ b/Geschichte_8/Generalstaende_Stunde1/Tafelskript_Generalstaende_Stunde1.docx
@@ -1554,7 +1554,7 @@
           <w:sz w:val="21"/>
           <w:szCs w:val="21"/>
         </w:rPr>
-        <w:t xml:space="preserve">Material: Text „Wie kam es zu den Generalständen?“ mit Zeitstrahl auf der Rückseite (ein Blatt pro Person, Datenfelder leer), Tests (verdeckt), Folien 1 bis 5, Grün zum Verbessern. Vorab an der Tafel vorbereiten: Strichliste der Noten (ohne Namen) und die Erfolgsquote je Test-Aufgabe in Prozent.</w:t>
+        <w:t xml:space="preserve">Material: Text „Wie kam es zu den Generalständen?“ mit Zeitstrahl unten auf demselben Blatt (ein Blatt pro Person, Datenfelder leer), Tests (verdeckt), Folien 1 bis 5, Grün zum Verbessern. Vorab an der Tafel vorbereiten: Strichliste der Noten (ohne Namen) und die Erfolgsquote je Test-Aufgabe in Prozent.</w:t>
       </w:r>
     </w:p>
     <w:p>
@@ -2186,7 +2186,7 @@
                 <w:sz w:val="21"/>
                 <w:szCs w:val="21"/>
               </w:rPr>
-              <w:t xml:space="preserve">Folie 1. Text und Zeitstrahl austeilen (Vorderseite Text, Rückseite Zeitstrahl mit den Ereignissen, aber leeren Datenfeldern). 5 Minuten lesen, Jahreszahlen unterstreichen, Daten im Zeitstrahl eintragen.</w:t>
+              <w:t xml:space="preserve">Folie 1. Blatt austeilen (oben der Text, unten der Zeitstrahl mit den Ereignissen, aber leeren Datenfeldern). 5 Minuten lesen, Jahreszahlen unterstreichen, Daten im Zeitstrahl eintragen.</w:t>
             </w:r>
           </w:p>
           <w:tbl>

</xml_diff>

<commit_message>
Geschichte 8: Abstimmung erst historisches Beispiel, dann Schulbeispiel
Co-Authored-By: Claude Sonnet 5.5 <noreply@anthropic.com>
Claude-Session: https://claude.ai/code/session_01CtRuNVyt8v9M882BKEmgNb
</commit_message>
<xml_diff>
--- a/Geschichte_8/Generalstaende_Stunde1/Tafelskript_Generalstaende_Stunde1.docx
+++ b/Geschichte_8/Generalstaende_Stunde1/Tafelskript_Generalstaende_Stunde1.docx
@@ -45,7 +45,7 @@
           <w:sz w:val="21"/>
           <w:szCs w:val="21"/>
         </w:rPr>
-        <w:t xml:space="preserve">Ziel: Die Klasse bekommt den Test zurück und reflektiert ihre Vorbereitung. Sie erarbeitet den Verlauf bis zu den Generalständen als Zeitleiste und erlebt in einer Mini-Abstimmung, wie unfair die Abstimmung nach Ständen ist. Aufbau nach AVIVA. Es gibt keinen Hörtext, der Text wird gelesen. Rollen der beiden Lehrkräfte: L1 moderiert, L2 spielt in der Abstimmung den Adel und unterstützt an der Tafel.</w:t>
+        <w:t xml:space="preserve">Ziel: Die Klasse bekommt den Test zurück und reflektiert ihre Vorbereitung. Sie erarbeitet den Verlauf bis zu den Generalständen als Zeitleiste und erlebt zuerst an einem historischen Beispiel und dann in einer Mini-Abstimmung in der Schule, wie unfair die Abstimmung nach Ständen ist. Aufbau nach AVIVA. Es gibt keinen Hörtext, der Text wird gelesen. Rollen der beiden Lehrkräfte: L1 moderiert, L2 spielt in der Abstimmung den Adel und unterstützt an der Tafel.</w:t>
       </w:r>
     </w:p>
     <w:tbl>
@@ -745,7 +745,7 @@
                 <w:sz w:val="20"/>
                 <w:szCs w:val="20"/>
               </w:rPr>
-              <w:t xml:space="preserve">3  Zahlen, Mini-Abstimmung, Rechnung, Merksatz</w:t>
+              <w:t xml:space="preserve">3  Zahlen, Abstimmung 1789, Schulbeispiel, Rechnung, Merksatz</w:t>
             </w:r>
           </w:p>
         </w:tc>
@@ -1554,7 +1554,7 @@
           <w:sz w:val="21"/>
           <w:szCs w:val="21"/>
         </w:rPr>
-        <w:t xml:space="preserve">Material: Text „Wie kam es zu den Generalständen?“ mit Zeitstrahl unten auf demselben Blatt (ein Blatt pro Person, Datenfelder leer), Tests (verdeckt), Folien 1 bis 5, Grün zum Verbessern. Vorab an der Tafel vorbereiten: Strichliste der Noten (ohne Namen) und die Erfolgsquote je Test-Aufgabe in Prozent.</w:t>
+        <w:t xml:space="preserve">Material: Text „Wie kam es zu den Generalständen?“ mit Zeitstrahl unten auf demselben Blatt (ein Blatt pro Person, Datenfelder leer), Tests (verdeckt), Folien 1 bis 6, Grün zum Verbessern. Vorab an der Tafel vorbereiten: Strichliste der Noten (ohne Namen) und die Erfolgsquote je Test-Aufgabe in Prozent.</w:t>
       </w:r>
     </w:p>
     <w:p>
@@ -2766,7 +2766,7 @@
           <w:sz w:val="28"/>
           <w:szCs w:val="28"/>
         </w:rPr>
-        <w:t xml:space="preserve">Zahlen, Mini-Abstimmung, Rechnung</w:t>
+        <w:t xml:space="preserve">Abstimmung: erst 1789, dann die Schule</w:t>
       </w:r>
       <w:r>
         <w:rPr>
@@ -3861,7 +3861,7 @@
                 <w:sz w:val="20"/>
                 <w:szCs w:val="20"/>
               </w:rPr>
-              <w:t xml:space="preserve">spielt mit, meldet sich</w:t>
+              <w:t xml:space="preserve">rechnet mit, meldet sich</w:t>
             </w:r>
           </w:p>
         </w:tc>
@@ -3906,7 +3906,7 @@
                 <w:sz w:val="21"/>
                 <w:szCs w:val="21"/>
               </w:rPr>
-              <w:t xml:space="preserve">„Wir spielen jetzt eine Abstimmung. Das ist nur ein Spiel, es gilt nicht. Die Lehrkräfte sind Klerus und Adel, ihr seid der Dritte Stand (Bauern und Bürger).“</w:t>
+              <w:t xml:space="preserve">„Meldet euch. Ihr schreibt noch nichts auf. Stellt euch vor, 1789 stimmt man über diesen Antrag ab.“</w:t>
             </w:r>
           </w:p>
           <w:p>
@@ -3920,7 +3920,7 @@
                 <w:sz w:val="21"/>
                 <w:szCs w:val="21"/>
               </w:rPr>
-              <w:t xml:space="preserve">3b  Folie 3 zeigen (5 Minuten): Antrag „Nur Schüler putzen künftig das Klassenzimmer und räumen die Tische auf. Lehrkräfte sind davon befreit.“</w:t>
+              <w:t xml:space="preserve">3b  Historisches Beispiel (3 Minuten). Folie 3: Antrag „Auch Adel und Klerus zahlen künftig Steuern.“ Modellannahme: Klerus und Adel stimmen geschlossen mit Nein, der Dritte Stand mit Ja.</w:t>
             </w:r>
           </w:p>
           <w:p>
@@ -3934,7 +3934,7 @@
                 <w:sz w:val="21"/>
                 <w:szCs w:val="21"/>
               </w:rPr>
-              <w:t xml:space="preserve">Schritt 1, Abstimmung nach Ständen: Jeder Stand hat eine Stimme. Die Schüler beraten 30 Sekunden und stimmen als Gruppe ab. L1 (Klerus) Ja, L2 (Adel) Ja, Dritter Stand Nein. Ergebnis 2:1, der Antrag ist angenommen. Ein Schüler schreibt das Ergebnis an die Tafel.</w:t>
+              <w:t xml:space="preserve">Schritt 1, Abstimmung nach Ständen: Die Klasse rechnet. Klerus Nein, Adel Nein, Dritter Stand Ja. Ergebnis 2:1, der Antrag ist abgelehnt. Ein Schüler schreibt das Ergebnis an die Tafel.</w:t>
             </w:r>
           </w:p>
           <w:p>
@@ -3948,7 +3948,7 @@
                 <w:sz w:val="21"/>
                 <w:szCs w:val="21"/>
               </w:rPr>
-              <w:t xml:space="preserve">Reaktion der Klasse abwarten: „Wir sind doch viel mehr!“ Dann Schritt 2, Abstimmung nach Köpfen: 2 Ja, 12 Nein. Ergebnis 2:12, der Antrag ist abgelehnt.</w:t>
+              <w:t xml:space="preserve">Schritt 2, Abstimmung nach Köpfen: Ja 580, Nein 290 + 270 = 560. Der Antrag wäre knapp angenommen. Die Klasse bemerkt: Es entscheidet also der Abstimmungsmodus, nicht die Mehrheit der Menschen.</w:t>
             </w:r>
           </w:p>
           <w:p>
@@ -3962,7 +3962,129 @@
                 <w:sz w:val="21"/>
                 <w:szCs w:val="21"/>
               </w:rPr>
-              <w:t xml:space="preserve">Fragen: Wie fühlt sich das an? Was war unfair? Was ist das Problem: die Lehrkräfte oder die Regeln?</w:t>
+              <w:t xml:space="preserve">Frage: „Wie wichtig wäre die Abstimmungsregel für den Dritten Stand?“</w:t>
+            </w:r>
+          </w:p>
+          <w:tbl>
+            <w:tblPr>
+              <w:tblW w:type="dxa" w:w="8166"/>
+              <w:tblBorders>
+                <w:top w:val="single" w:color="auto" w:sz="4"/>
+                <w:left w:val="single" w:color="auto" w:sz="4"/>
+                <w:bottom w:val="single" w:color="auto" w:sz="4"/>
+                <w:right w:val="single" w:color="auto" w:sz="4"/>
+                <w:insideH w:val="single" w:color="auto" w:sz="4"/>
+                <w:insideV w:val="single" w:color="auto" w:sz="4"/>
+              </w:tblBorders>
+            </w:tblPr>
+            <w:tblGrid>
+              <w:gridCol w:w="8166"/>
+            </w:tblGrid>
+            <w:tr>
+              <w:trPr>
+                <w:cantSplit/>
+              </w:trPr>
+              <w:tc>
+                <w:tcPr>
+                  <w:tcW w:type="dxa" w:w="8166"/>
+                  <w:tcBorders>
+                    <w:top w:val="single" w:color="3D4A3F" w:sz="12"/>
+                    <w:left w:val="single" w:color="3D4A3F" w:sz="12"/>
+                    <w:bottom w:val="single" w:color="3D4A3F" w:sz="12"/>
+                    <w:right w:val="single" w:color="3D4A3F" w:sz="12"/>
+                  </w:tcBorders>
+                  <w:shd w:fill="3D4A3F" w:color="auto" w:val="clear"/>
+                  <w:tcMar>
+                    <w:top w:type="dxa" w:w="40"/>
+                    <w:left w:type="dxa" w:w="110"/>
+                    <w:bottom w:type="dxa" w:w="40"/>
+                    <w:right w:type="dxa" w:w="110"/>
+                  </w:tcMar>
+                  <w:vAlign w:val="center"/>
+                </w:tcPr>
+                <w:p>
+                  <w:pPr>
+                    <w:spacing w:after="0" w:before="0"/>
+                  </w:pPr>
+                  <w:r>
+                    <w:rPr>
+                      <w:rFonts w:ascii="Calibri" w:cs="Calibri" w:eastAsia="Calibri" w:hAnsi="Calibri"/>
+                      <w:b/>
+                      <w:bCs/>
+                      <w:color w:val="FFFFFF"/>
+                      <w:sz w:val="16"/>
+                      <w:szCs w:val="16"/>
+                    </w:rPr>
+                    <w:t xml:space="preserve">TAFEL · Mitte · Abstimmung 1789 (Modell)</w:t>
+                  </w:r>
+                </w:p>
+              </w:tc>
+            </w:tr>
+            <w:tr>
+              <w:trPr>
+                <w:cantSplit/>
+              </w:trPr>
+              <w:tc>
+                <w:tcPr>
+                  <w:tcW w:type="dxa" w:w="8166"/>
+                  <w:tcBorders>
+                    <w:top w:val="single" w:color="3D4A3F" w:sz="12"/>
+                    <w:left w:val="single" w:color="3D4A3F" w:sz="12"/>
+                    <w:bottom w:val="single" w:color="3D4A3F" w:sz="12"/>
+                    <w:right w:val="single" w:color="3D4A3F" w:sz="12"/>
+                  </w:tcBorders>
+                  <w:shd w:fill="F3F6F1" w:color="auto" w:val="clear"/>
+                  <w:tcMar>
+                    <w:top w:type="dxa" w:w="100"/>
+                    <w:left w:type="dxa" w:w="110"/>
+                    <w:bottom w:type="dxa" w:w="100"/>
+                    <w:right w:type="dxa" w:w="110"/>
+                  </w:tcMar>
+                  <w:vAlign w:val="top"/>
+                </w:tcPr>
+                <w:p>
+                  <w:pPr>
+                    <w:spacing w:after="30" w:before="0"/>
+                  </w:pPr>
+                  <w:r>
+                    <w:rPr>
+                      <w:rFonts w:ascii="Cambria" w:cs="Cambria" w:eastAsia="Cambria" w:hAnsi="Cambria"/>
+                      <w:color w:val="000000"/>
+                      <w:sz w:val="20"/>
+                      <w:szCs w:val="20"/>
+                    </w:rPr>
+                    <w:t xml:space="preserve">nach Ständen:   Klerus Nein · Adel Nein · Dritter Stand Ja   →   2 : 1   →   abgelehnt</w:t>
+                  </w:r>
+                </w:p>
+                <w:p>
+                  <w:pPr>
+                    <w:spacing w:after="0" w:before="0"/>
+                  </w:pPr>
+                  <w:r>
+                    <w:rPr>
+                      <w:rFonts w:ascii="Cambria" w:cs="Cambria" w:eastAsia="Cambria" w:hAnsi="Cambria"/>
+                      <w:color w:val="000000"/>
+                      <w:sz w:val="20"/>
+                      <w:szCs w:val="20"/>
+                    </w:rPr>
+                    <w:t xml:space="preserve">nach Köpfen:    Ja 580 · Nein 290 + 270 = 560   →   knapp angenommen</w:t>
+                  </w:r>
+                </w:p>
+              </w:tc>
+            </w:tr>
+          </w:tbl>
+          <w:p>
+            <w:pPr>
+              <w:spacing w:after="30" w:before="0"/>
+            </w:pPr>
+            <w:r>
+              <w:rPr>
+                <w:rFonts w:ascii="Calibri" w:cs="Calibri" w:eastAsia="Calibri" w:hAnsi="Calibri"/>
+                <w:color w:val="000000"/>
+                <w:sz w:val="22"/>
+                <w:szCs w:val="22"/>
+              </w:rPr>
+              <w:t xml:space="preserve"/>
             </w:r>
           </w:p>
           <w:p>
@@ -3987,86 +4109,7 @@
                 <w:sz w:val="19"/>
                 <w:szCs w:val="19"/>
               </w:rPr>
-              <w:t xml:space="preserve">Die Regeln sind das Problem, nicht die Personen. Betonen Sie die Rollen („Wir spielen“), damit es nicht persönlich wird.</w:t>
-            </w:r>
-          </w:p>
-        </w:tc>
-      </w:tr>
-    </w:tbl>
-    <w:p>
-      <w:pPr>
-        <w:spacing w:after="20" w:before="0"/>
-      </w:pPr>
-      <w:r>
-        <w:rPr>
-          <w:rFonts w:ascii="Calibri" w:cs="Calibri" w:eastAsia="Calibri" w:hAnsi="Calibri"/>
-          <w:color w:val="000000"/>
-          <w:sz w:val="22"/>
-          <w:szCs w:val="22"/>
-        </w:rPr>
-        <w:t xml:space="preserve"/>
-      </w:r>
-    </w:p>
-    <w:tbl>
-      <w:tblPr>
-        <w:tblW w:type="dxa" w:w="8166"/>
-        <w:tblBorders>
-          <w:top w:val="single" w:color="auto" w:sz="4"/>
-          <w:left w:val="single" w:color="auto" w:sz="4"/>
-          <w:bottom w:val="single" w:color="auto" w:sz="4"/>
-          <w:right w:val="single" w:color="auto" w:sz="4"/>
-          <w:insideH w:val="single" w:color="auto" w:sz="4"/>
-          <w:insideV w:val="single" w:color="auto" w:sz="4"/>
-        </w:tblBorders>
-      </w:tblPr>
-      <w:tblGrid>
-        <w:gridCol w:w="8166"/>
-      </w:tblGrid>
-      <w:tr>
-        <w:trPr>
-          <w:cantSplit/>
-        </w:trPr>
-        <w:tc>
-          <w:tcPr>
-            <w:tcW w:type="dxa" w:w="8166"/>
-            <w:tcBorders>
-              <w:top w:val="single" w:color="E8A33D" w:sz="8"/>
-              <w:left w:val="single" w:color="E8A33D" w:sz="8"/>
-              <w:bottom w:val="single" w:color="E8A33D" w:sz="8"/>
-              <w:right w:val="single" w:color="E8A33D" w:sz="8"/>
-            </w:tcBorders>
-            <w:shd w:fill="FFF6E0" w:color="auto" w:val="clear"/>
-            <w:tcMar>
-              <w:top w:type="dxa" w:w="70"/>
-              <w:left w:type="dxa" w:w="110"/>
-              <w:bottom w:type="dxa" w:w="70"/>
-              <w:right w:type="dxa" w:w="110"/>
-            </w:tcMar>
-            <w:vAlign w:val="center"/>
-          </w:tcPr>
-          <w:p>
-            <w:pPr>
-              <w:spacing w:after="0" w:before="0"/>
-            </w:pPr>
-            <w:r>
-              <w:rPr>
-                <w:rFonts w:ascii="Calibri" w:cs="Calibri" w:eastAsia="Calibri" w:hAnsi="Calibri"/>
-                <w:b/>
-                <w:bCs/>
-                <w:color w:val="B03A36"/>
-                <w:sz w:val="19"/>
-                <w:szCs w:val="19"/>
-              </w:rPr>
-              <w:t xml:space="preserve">SOLLBRUCHSTELLE  </w:t>
-            </w:r>
-            <w:r>
-              <w:rPr>
-                <w:rFonts w:ascii="Calibri" w:cs="Calibri" w:eastAsia="Calibri" w:hAnsi="Calibri"/>
-                <w:color w:val="000000"/>
-                <w:sz w:val="19"/>
-                <w:szCs w:val="19"/>
-              </w:rPr>
-              <w:t xml:space="preserve">Wenn die Zeit knapp wird, entfällt 3b (die Mini-Abstimmung) und beginnt Stunde 2 (5 Minuten). Stunde 1 endet dann nach 3a mit der Frage: „Wie würdet ihr abstimmen lassen?“ Phase 4 wird mündlich.</w:t>
+              <w:t xml:space="preserve">Hinweis: Die Annahme „geschlossen“ ist vereinfacht. Tatsächlich unterstützten manche Geistliche (vor allem Pfarrer) und einzelne Adlige den Dritten Stand, nach Köpfen wäre das Ergebnis also deutlicher. Wichtig bleibt: Dieselben Stimmen führen je nach Regel zu zwei verschiedenen Ergebnissen.</w:t>
             </w:r>
           </w:p>
         </w:tc>
@@ -4151,7 +4194,7 @@
                 <w:sz w:val="20"/>
                 <w:szCs w:val="20"/>
               </w:rPr>
-              <w:t xml:space="preserve">rechnet mit, schreibt ab</w:t>
+              <w:t xml:space="preserve">spielt mit, meldet sich</w:t>
             </w:r>
           </w:p>
         </w:tc>
@@ -4196,7 +4239,7 @@
                 <w:sz w:val="21"/>
                 <w:szCs w:val="21"/>
               </w:rPr>
-              <w:t xml:space="preserve">„Meldet euch. Ihr schreibt noch nichts auf. Wie viel zählt eine Stimme?“</w:t>
+              <w:t xml:space="preserve">„Jetzt spielen wir dasselbe in der Schule. Das ist nur ein Spiel, es gilt nicht. Die Lehrkräfte sind Klerus und Adel, ihr seid der Dritte Stand (Bauern und Bürger).“</w:t>
             </w:r>
           </w:p>
           <w:p>
@@ -4210,7 +4253,7 @@
                 <w:sz w:val="21"/>
                 <w:szCs w:val="21"/>
               </w:rPr>
-              <w:t xml:space="preserve">3c  Rechnung (3 Minuten) an der Tafel: Im Klassenspiel zählt eine Lehrerstimme wie 1 Person, die Schülerstimme nur wie 1 von 12. Die Lehrerstimme wiegt zwölfmal so viel.</w:t>
+              <w:t xml:space="preserve">3c  Schulbeispiel (4 Minuten). Folie 4: Antrag „Nur Schüler putzen künftig das Klassenzimmer und räumen die Tische auf. Lehrkräfte sind davon befreit.“</w:t>
             </w:r>
           </w:p>
           <w:p>
@@ -4224,7 +4267,7 @@
                 <w:sz w:val="21"/>
                 <w:szCs w:val="21"/>
               </w:rPr>
-              <w:t xml:space="preserve">Übertragung: In Frankreich stehen hinter einer Stimme des Klerus 150 000 Menschen, hinter einer Stimme des Dritten Standes (Bauern und Bürger) 20 000 000. 20 000 000 : 150 000 ≈ 133. Beim Adel: 20 000 000 : 500 000 = 40.</w:t>
+              <w:t xml:space="preserve">Schritt 1, Abstimmung nach Ständen: Jeder Stand eine Stimme. Die Schüler beraten 30 Sekunden und stimmen als Gruppe ab. L1 (Klerus) Ja, L2 (Adel) Ja, Dritter Stand Nein. Ergebnis 2:1, angenommen. Ein Schüler schreibt es an die Tafel.</w:t>
             </w:r>
           </w:p>
           <w:p>
@@ -4238,7 +4281,7 @@
                 <w:sz w:val="21"/>
                 <w:szCs w:val="21"/>
               </w:rPr>
-              <w:t xml:space="preserve">Frage: „Was würdet ihr als Dritter Stand in Frankreich fordern?“ Erwartung: Abstimmung nach Köpfen. Das ist genau, was die Abgeordneten 1789 fordern (Brücke zu Stunde 2).</w:t>
+              <w:t xml:space="preserve">Reaktion der Klasse abwarten: „Wir sind doch viel mehr!“ Dann Schritt 2, Abstimmung nach Köpfen: 2 Ja, 12 Nein, abgelehnt.</w:t>
             </w:r>
           </w:p>
           <w:p>
@@ -4252,7 +4295,297 @@
                 <w:sz w:val="21"/>
                 <w:szCs w:val="21"/>
               </w:rPr>
-              <w:t xml:space="preserve">3d  Merksatz: „Jetzt schreibt ihr von der Folie ab: Merksatz 1. Rahmt ihn rot ein.“ (Folie 4)</w:t>
+              <w:t xml:space="preserve">Fragen: Wie fühlt sich das an? Was war unfair? Sind die Lehrkräfte das Problem oder die Regeln?</w:t>
+            </w:r>
+          </w:p>
+          <w:p>
+            <w:pPr>
+              <w:spacing w:after="0" w:before="0"/>
+            </w:pPr>
+            <w:r>
+              <w:rPr>
+                <w:rFonts w:ascii="Calibri" w:cs="Calibri" w:eastAsia="Calibri" w:hAnsi="Calibri"/>
+                <w:b/>
+                <w:bCs/>
+                <w:color w:val="5B6B8C"/>
+                <w:sz w:val="19"/>
+                <w:szCs w:val="19"/>
+              </w:rPr>
+              <w:t xml:space="preserve">Erwartung: </w:t>
+            </w:r>
+            <w:r>
+              <w:rPr>
+                <w:rFonts w:ascii="Calibri" w:cs="Calibri" w:eastAsia="Calibri" w:hAnsi="Calibri"/>
+                <w:color w:val="5B6B8C"/>
+                <w:sz w:val="19"/>
+                <w:szCs w:val="19"/>
+              </w:rPr>
+              <w:t xml:space="preserve">Die Regeln sind das Problem, nicht die Personen. Betonen Sie die Rollen („Wir spielen“), damit es nicht persönlich wird. Unterschied zu 1789: In der Schule ist das Ergebnis deutlich (12 gegen 2), 1789 knapp (580 gegen 560), weil der Dritte Stand mehr Abgeordnete bekam.</w:t>
+            </w:r>
+          </w:p>
+        </w:tc>
+      </w:tr>
+    </w:tbl>
+    <w:p>
+      <w:pPr>
+        <w:spacing w:after="20" w:before="0"/>
+      </w:pPr>
+      <w:r>
+        <w:rPr>
+          <w:rFonts w:ascii="Calibri" w:cs="Calibri" w:eastAsia="Calibri" w:hAnsi="Calibri"/>
+          <w:color w:val="000000"/>
+          <w:sz w:val="22"/>
+          <w:szCs w:val="22"/>
+        </w:rPr>
+        <w:t xml:space="preserve"/>
+      </w:r>
+    </w:p>
+    <w:tbl>
+      <w:tblPr>
+        <w:tblW w:type="dxa" w:w="8166"/>
+        <w:tblBorders>
+          <w:top w:val="single" w:color="auto" w:sz="4"/>
+          <w:left w:val="single" w:color="auto" w:sz="4"/>
+          <w:bottom w:val="single" w:color="auto" w:sz="4"/>
+          <w:right w:val="single" w:color="auto" w:sz="4"/>
+          <w:insideH w:val="single" w:color="auto" w:sz="4"/>
+          <w:insideV w:val="single" w:color="auto" w:sz="4"/>
+        </w:tblBorders>
+      </w:tblPr>
+      <w:tblGrid>
+        <w:gridCol w:w="8166"/>
+      </w:tblGrid>
+      <w:tr>
+        <w:trPr>
+          <w:cantSplit/>
+        </w:trPr>
+        <w:tc>
+          <w:tcPr>
+            <w:tcW w:type="dxa" w:w="8166"/>
+            <w:tcBorders>
+              <w:top w:val="single" w:color="E8A33D" w:sz="8"/>
+              <w:left w:val="single" w:color="E8A33D" w:sz="8"/>
+              <w:bottom w:val="single" w:color="E8A33D" w:sz="8"/>
+              <w:right w:val="single" w:color="E8A33D" w:sz="8"/>
+            </w:tcBorders>
+            <w:shd w:fill="FFF6E0" w:color="auto" w:val="clear"/>
+            <w:tcMar>
+              <w:top w:type="dxa" w:w="70"/>
+              <w:left w:type="dxa" w:w="110"/>
+              <w:bottom w:type="dxa" w:w="70"/>
+              <w:right w:type="dxa" w:w="110"/>
+            </w:tcMar>
+            <w:vAlign w:val="center"/>
+          </w:tcPr>
+          <w:p>
+            <w:pPr>
+              <w:spacing w:after="0" w:before="0"/>
+            </w:pPr>
+            <w:r>
+              <w:rPr>
+                <w:rFonts w:ascii="Calibri" w:cs="Calibri" w:eastAsia="Calibri" w:hAnsi="Calibri"/>
+                <w:b/>
+                <w:bCs/>
+                <w:color w:val="B03A36"/>
+                <w:sz w:val="19"/>
+                <w:szCs w:val="19"/>
+              </w:rPr>
+              <w:t xml:space="preserve">SOLLBRUCHSTELLE  </w:t>
+            </w:r>
+            <w:r>
+              <w:rPr>
+                <w:rFonts w:ascii="Calibri" w:cs="Calibri" w:eastAsia="Calibri" w:hAnsi="Calibri"/>
+                <w:color w:val="000000"/>
+                <w:sz w:val="19"/>
+                <w:szCs w:val="19"/>
+              </w:rPr>
+              <w:t xml:space="preserve">Wenn die Zeit knapp wird, entfällt 3c (das Schulbeispiel) und beginnt Stunde 2 (4 Minuten). Das historische Beispiel 3b und der Merksatz bleiben in Stunde 1. Phase 4 wird dann mündlich.</w:t>
+            </w:r>
+          </w:p>
+        </w:tc>
+      </w:tr>
+    </w:tbl>
+    <w:p>
+      <w:pPr>
+        <w:spacing w:after="20" w:before="0"/>
+      </w:pPr>
+      <w:r>
+        <w:rPr>
+          <w:rFonts w:ascii="Calibri" w:cs="Calibri" w:eastAsia="Calibri" w:hAnsi="Calibri"/>
+          <w:color w:val="000000"/>
+          <w:sz w:val="22"/>
+          <w:szCs w:val="22"/>
+        </w:rPr>
+        <w:t xml:space="preserve"/>
+      </w:r>
+    </w:p>
+    <w:tbl>
+      <w:tblPr>
+        <w:tblW w:type="dxa" w:w="10206"/>
+        <w:tblBorders>
+          <w:top w:val="single" w:color="auto" w:sz="4"/>
+          <w:left w:val="single" w:color="auto" w:sz="4"/>
+          <w:bottom w:val="single" w:color="auto" w:sz="4"/>
+          <w:right w:val="single" w:color="auto" w:sz="4"/>
+          <w:insideH w:val="single" w:color="auto" w:sz="4"/>
+          <w:insideV w:val="single" w:color="auto" w:sz="4"/>
+        </w:tblBorders>
+      </w:tblPr>
+      <w:tblGrid>
+        <w:gridCol w:w="1700"/>
+        <w:gridCol w:w="8506"/>
+      </w:tblGrid>
+      <w:tr>
+        <w:trPr>
+          <w:cantSplit/>
+        </w:trPr>
+        <w:tc>
+          <w:tcPr>
+            <w:tcW w:type="dxa" w:w="1700"/>
+            <w:tcBorders>
+              <w:top w:val="single" w:color="B9C6E8" w:sz="6"/>
+              <w:left w:val="single" w:color="B9C6E8" w:sz="6"/>
+              <w:bottom w:val="single" w:color="B9C6E8" w:sz="6"/>
+              <w:right w:val="single" w:color="B9C6E8" w:sz="6"/>
+            </w:tcBorders>
+            <w:shd w:fill="F4F7FD" w:color="auto" w:val="clear"/>
+            <w:tcMar>
+              <w:top w:type="dxa" w:w="70"/>
+              <w:left w:type="dxa" w:w="110"/>
+              <w:bottom w:type="dxa" w:w="70"/>
+              <w:right w:type="dxa" w:w="110"/>
+            </w:tcMar>
+            <w:vAlign w:val="top"/>
+          </w:tcPr>
+          <w:p>
+            <w:pPr>
+              <w:spacing w:after="10" w:before="0"/>
+            </w:pPr>
+            <w:r>
+              <w:rPr>
+                <w:rFonts w:ascii="Calibri" w:cs="Calibri" w:eastAsia="Calibri" w:hAnsi="Calibri"/>
+                <w:color w:val="5B6B8C"/>
+                <w:sz w:val="16"/>
+                <w:szCs w:val="16"/>
+              </w:rPr>
+              <w:t xml:space="preserve">Klasse</w:t>
+            </w:r>
+          </w:p>
+          <w:p>
+            <w:pPr>
+              <w:spacing w:after="0" w:before="0"/>
+            </w:pPr>
+            <w:r>
+              <w:rPr>
+                <w:rFonts w:ascii="Calibri" w:cs="Calibri" w:eastAsia="Calibri" w:hAnsi="Calibri"/>
+                <w:b/>
+                <w:bCs/>
+                <w:color w:val="1E2761"/>
+                <w:sz w:val="20"/>
+                <w:szCs w:val="20"/>
+              </w:rPr>
+              <w:t xml:space="preserve">rechnet mit, schreibt ab</w:t>
+            </w:r>
+          </w:p>
+        </w:tc>
+        <w:tc>
+          <w:tcPr>
+            <w:tcW w:type="dxa" w:w="8506"/>
+            <w:tcBorders>
+              <w:top w:val="single" w:color="B9C6E8" w:sz="6"/>
+              <w:left w:val="single" w:color="B9C6E8" w:sz="6"/>
+              <w:bottom w:val="single" w:color="B9C6E8" w:sz="6"/>
+              <w:right w:val="single" w:color="B9C6E8" w:sz="6"/>
+            </w:tcBorders>
+            <w:tcMar>
+              <w:top w:type="dxa" w:w="70"/>
+              <w:left w:type="dxa" w:w="110"/>
+              <w:bottom w:type="dxa" w:w="70"/>
+              <w:right w:type="dxa" w:w="110"/>
+            </w:tcMar>
+            <w:vAlign w:val="top"/>
+          </w:tcPr>
+          <w:p>
+            <w:pPr>
+              <w:spacing w:after="60" w:before="0"/>
+            </w:pPr>
+            <w:r>
+              <w:rPr>
+                <w:rFonts w:ascii="Calibri" w:cs="Calibri" w:eastAsia="Calibri" w:hAnsi="Calibri"/>
+                <w:b/>
+                <w:bCs/>
+                <w:color w:val="D9534F"/>
+                <w:sz w:val="20"/>
+                <w:szCs w:val="20"/>
+              </w:rPr>
+              <w:t xml:space="preserve">Ansage: </w:t>
+            </w:r>
+            <w:r>
+              <w:rPr>
+                <w:rFonts w:ascii="Calibri" w:cs="Calibri" w:eastAsia="Calibri" w:hAnsi="Calibri"/>
+                <w:i/>
+                <w:iCs/>
+                <w:color w:val="000000"/>
+                <w:sz w:val="21"/>
+                <w:szCs w:val="21"/>
+              </w:rPr>
+              <w:t xml:space="preserve">„Meldet euch. Ihr schreibt noch nichts auf. Wie viel zählt eine Stimme?“</w:t>
+            </w:r>
+          </w:p>
+          <w:p>
+            <w:pPr>
+              <w:spacing w:after="50" w:before="0"/>
+            </w:pPr>
+            <w:r>
+              <w:rPr>
+                <w:rFonts w:ascii="Calibri" w:cs="Calibri" w:eastAsia="Calibri" w:hAnsi="Calibri"/>
+                <w:color w:val="000000"/>
+                <w:sz w:val="21"/>
+                <w:szCs w:val="21"/>
+              </w:rPr>
+              <w:t xml:space="preserve">3d  Rechnung und Merksatz (4 Minuten): Im Klassenspiel zählt eine Lehrerstimme wie 1 Person, die Schülerstimme nur wie 1 von 12. Die Lehrerstimme wiegt zwölfmal so viel.</w:t>
+            </w:r>
+          </w:p>
+          <w:p>
+            <w:pPr>
+              <w:spacing w:after="50" w:before="0"/>
+            </w:pPr>
+            <w:r>
+              <w:rPr>
+                <w:rFonts w:ascii="Calibri" w:cs="Calibri" w:eastAsia="Calibri" w:hAnsi="Calibri"/>
+                <w:color w:val="000000"/>
+                <w:sz w:val="21"/>
+                <w:szCs w:val="21"/>
+              </w:rPr>
+              <w:t xml:space="preserve">Übertragung: In Frankreich stehen hinter einer Stimme des Klerus 150 000 Menschen, hinter einer Stimme des Dritten Standes (Bauern und Bürger) 20 000 000. 20 000 000 : 150 000 ≈ 133. Beim Adel: 20 000 000 : 500 000 = 40.</w:t>
+            </w:r>
+          </w:p>
+          <w:p>
+            <w:pPr>
+              <w:spacing w:after="50" w:before="0"/>
+            </w:pPr>
+            <w:r>
+              <w:rPr>
+                <w:rFonts w:ascii="Calibri" w:cs="Calibri" w:eastAsia="Calibri" w:hAnsi="Calibri"/>
+                <w:color w:val="000000"/>
+                <w:sz w:val="21"/>
+                <w:szCs w:val="21"/>
+              </w:rPr>
+              <w:t xml:space="preserve">Frage: „Was würdet ihr als Dritter Stand in Frankreich fordern?“ Erwartung: Abstimmung nach Köpfen. Das ist genau, was die Abgeordneten 1789 fordern (Brücke zu Stunde 2).</w:t>
+            </w:r>
+          </w:p>
+          <w:p>
+            <w:pPr>
+              <w:spacing w:after="50" w:before="0"/>
+            </w:pPr>
+            <w:r>
+              <w:rPr>
+                <w:rFonts w:ascii="Calibri" w:cs="Calibri" w:eastAsia="Calibri" w:hAnsi="Calibri"/>
+                <w:color w:val="000000"/>
+                <w:sz w:val="21"/>
+                <w:szCs w:val="21"/>
+              </w:rPr>
+              <w:t xml:space="preserve">„Jetzt schreibt ihr von der Folie ab: Merksatz 1. Rahmt ihn rot ein.“ (Folie 5)</w:t>
             </w:r>
           </w:p>
           <w:tbl>
@@ -4305,7 +4638,7 @@
                       <w:sz w:val="16"/>
                       <w:szCs w:val="16"/>
                     </w:rPr>
-                    <w:t xml:space="preserve">FOLIE · 4 · Merksatz 1 – abschreiben, rot umrahmen</w:t>
+                    <w:t xml:space="preserve">FOLIE · 5 · Merksatz 1 – abschreiben, rot umrahmen</w:t>
                   </w:r>
                 </w:p>
               </w:tc>
@@ -4637,7 +4970,7 @@
                       <w:sz w:val="16"/>
                       <w:szCs w:val="16"/>
                     </w:rPr>
-                    <w:t xml:space="preserve">FOLIE · 5 · Ü2 Unfair?</w:t>
+                    <w:t xml:space="preserve">FOLIE · 6 · Ü2 Unfair?</w:t>
                   </w:r>
                 </w:p>
               </w:tc>

</xml_diff>

<commit_message>
Geschichte 8: Generalstände-Folien nach AVIVA mit Lernzielen und Visualisierungen
Co-Authored-By: Claude Sonnet 5.5 <noreply@anthropic.com>
Claude-Session: https://claude.ai/code/session_01CtRuNVyt8v9M882BKEmgNb
</commit_message>
<xml_diff>
--- a/Geschichte_8/Generalstaende_Stunde1/Tafelskript_Generalstaende_Stunde1.docx
+++ b/Geschichte_8/Generalstaende_Stunde1/Tafelskript_Generalstaende_Stunde1.docx
@@ -1554,7 +1554,7 @@
           <w:sz w:val="21"/>
           <w:szCs w:val="21"/>
         </w:rPr>
-        <w:t xml:space="preserve">Material: Text „Wie kam es zu den Generalständen?“ mit Zeitstrahl unten auf demselben Blatt (ein Blatt pro Person, Datenfelder leer), Tests (verdeckt), Folien 1 bis 6, Grün zum Verbessern. Vorab an der Tafel vorbereiten: Strichliste der Noten (ohne Namen) und die Erfolgsquote je Test-Aufgabe in Prozent.</w:t>
+        <w:t xml:space="preserve">Material: Text „Wie kam es zu den Generalständen?“ mit Zeitstrahl unten auf demselben Blatt (ein Blatt pro Person, Datenfelder leer), Tests (verdeckt), Folien 1 bis 16 (mit Lernzielen, Ablauf nach AVIVA und Visualisierungen), Grün zum Verbessern. Vorab an der Tafel vorbereiten: Strichliste der Noten (ohne Namen) und die Erfolgsquote je Test-Aufgabe in Prozent.</w:t>
       </w:r>
     </w:p>
     <w:p>
@@ -1731,7 +1731,7 @@
                 <w:sz w:val="21"/>
                 <w:szCs w:val="21"/>
               </w:rPr>
-              <w:t xml:space="preserve">1  Tests verdeckt austeilen. Niemand nennt Noten laut.</w:t>
+              <w:t xml:space="preserve">1  Folien 1 bis 4 (Titel, Lernziele, Ablauf, Test): Lernziele vorlesen lassen, Ablauf nach AVIVA zeigen. Tests verdeckt austeilen, niemand nennt Noten laut.</w:t>
             </w:r>
           </w:p>
           <w:p>
@@ -1992,7 +1992,7 @@
                 <w:sz w:val="21"/>
                 <w:szCs w:val="21"/>
               </w:rPr>
-              <w:t xml:space="preserve">Stichworte aus der Münzgeschichte an die Tafel (bleiben stehen): leere Staatskasse · ungleiche Steuerlast · Hunger und Brotpreis · keine Mitsprache des Dritten Standes (Bauern und Bürger) · Entfremdung zwischen Adel und Dorf.</w:t>
+              <w:t xml:space="preserve">Folie 5 (Probleme Frankreichs als Kacheln). Stichworte aus der Münzgeschichte an die Tafel (bleiben stehen): leere Staatskasse · ungleiche Steuerlast · Hunger und Brotpreis · keine Mitsprache des Dritten Standes (Bauern und Bürger) · Entfremdung zwischen Adel und Dorf.</w:t>
             </w:r>
           </w:p>
           <w:p>
@@ -2186,7 +2186,7 @@
                 <w:sz w:val="21"/>
                 <w:szCs w:val="21"/>
               </w:rPr>
-              <w:t xml:space="preserve">Folie 1. Blatt austeilen (oben der Text, unten der Zeitstrahl mit den Ereignissen, aber leeren Datenfeldern). 5 Minuten lesen, Jahreszahlen unterstreichen, Daten im Zeitstrahl eintragen.</w:t>
+              <w:t xml:space="preserve">Folie 1. Folie 6. Blatt austeilen (oben der Text, unten der Zeitstrahl mit den Ereignissen, aber leeren Datenfeldern). 5 Minuten lesen, Jahreszahlen unterstreichen, Daten im Zeitstrahl eintragen.</w:t>
             </w:r>
           </w:p>
           <w:tbl>
@@ -2239,7 +2239,7 @@
                       <w:sz w:val="16"/>
                       <w:szCs w:val="16"/>
                     </w:rPr>
-                    <w:t xml:space="preserve">FOLIE · 1 · Ü1 Text und Zeitstrahl</w:t>
+                    <w:t xml:space="preserve">FOLIE · 6 · Ü1 Text und Zeitstrahl</w:t>
                   </w:r>
                 </w:p>
               </w:tc>
@@ -2518,7 +2518,7 @@
                 <w:sz w:val="21"/>
                 <w:szCs w:val="21"/>
               </w:rPr>
-              <w:t xml:space="preserve">Kontrolle des Zeitstrahls, 5 Minuten. Pro Ereignis nennt ein Schüler oder eine Schülerin das Datum, ein Schüler oder eine Schülerin schreibt es an die Tafel (Stichwort daneben). Leitfrage danach:</w:t>
+              <w:t xml:space="preserve">Folie 7 (Zeitstrahl als Bild) erst zeigen, wenn die Klasse die Daten genannt hat. Kontrolle des Zeitstrahls, 5 Minuten. Pro Ereignis nennt ein Schüler oder eine Schülerin das Datum, ein Schüler oder eine Schülerin schreibt es an die Tafel (Stichwort daneben). Leitfrage danach:</w:t>
             </w:r>
           </w:p>
           <w:tbl>
@@ -2915,7 +2915,7 @@
                 <w:sz w:val="21"/>
                 <w:szCs w:val="21"/>
               </w:rPr>
-              <w:t xml:space="preserve">3a  Folie 2 zeigen (3 Minuten). Zahlen vergleichen: Wie viele Menschen, wie viele Abgeordnete, wie viele Stimmen?</w:t>
+              <w:t xml:space="preserve">3a  Folie 8 zeigen (3 Minuten, Balken). Zahlen vergleichen: Wie viele Menschen, wie viele Abgeordnete, wie viele Stimmen?</w:t>
             </w:r>
           </w:p>
           <w:tbl>
@@ -2968,7 +2968,7 @@
                       <w:sz w:val="16"/>
                       <w:szCs w:val="16"/>
                     </w:rPr>
-                    <w:t xml:space="preserve">FOLIE · 2 · Wer hat wie viel Gewicht?</w:t>
+                    <w:t xml:space="preserve">FOLIE · 8 · Wer hat wie viel Gewicht?</w:t>
                   </w:r>
                 </w:p>
               </w:tc>
@@ -3920,7 +3920,7 @@
                 <w:sz w:val="21"/>
                 <w:szCs w:val="21"/>
               </w:rPr>
-              <w:t xml:space="preserve">3b  Historisches Beispiel (3 Minuten). Folie 3: Antrag „Auch Adel und Klerus zahlen künftig Steuern.“ Modellannahme: Klerus und Adel stimmen geschlossen mit Nein, der Dritte Stand mit Ja.</w:t>
+              <w:t xml:space="preserve">3b  Historisches Beispiel (3 Minuten). Folie 9: Antrag „Auch Adel und Klerus zahlen künftig Steuern.“ Ergebnis auf Folie 10. Modellannahme: Klerus und Adel stimmen geschlossen mit Nein, der Dritte Stand mit Ja.</w:t>
             </w:r>
           </w:p>
           <w:p>
@@ -4253,7 +4253,7 @@
                 <w:sz w:val="21"/>
                 <w:szCs w:val="21"/>
               </w:rPr>
-              <w:t xml:space="preserve">3c  Schulbeispiel (4 Minuten). Folie 4: Antrag „Nur Schüler putzen künftig das Klassenzimmer und räumen die Tische auf. Lehrkräfte sind davon befreit.“</w:t>
+              <w:t xml:space="preserve">3c  Schulbeispiel (4 Minuten). Folie 11: Antrag „Nur Schüler putzen künftig das Klassenzimmer und räumen die Tische auf. Lehrkräfte sind davon befreit.“</w:t>
             </w:r>
           </w:p>
           <w:p>
@@ -4281,7 +4281,7 @@
                 <w:sz w:val="21"/>
                 <w:szCs w:val="21"/>
               </w:rPr>
-              <w:t xml:space="preserve">Reaktion der Klasse abwarten: „Wir sind doch viel mehr!“ Dann Schritt 2, Abstimmung nach Köpfen: 2 Ja, 12 Nein, abgelehnt.</w:t>
+              <w:t xml:space="preserve">Reaktion der Klasse abwarten: „Wir sind doch viel mehr!“ Dann Schritt 2, Abstimmung nach Köpfen: 2 Ja, 12 Nein, abgelehnt. Ergebnis auf Folie 12.</w:t>
             </w:r>
           </w:p>
           <w:p>
@@ -4543,7 +4543,7 @@
                 <w:sz w:val="21"/>
                 <w:szCs w:val="21"/>
               </w:rPr>
-              <w:t xml:space="preserve">3d  Rechnung und Merksatz (4 Minuten): Im Klassenspiel zählt eine Lehrerstimme wie 1 Person, die Schülerstimme nur wie 1 von 12. Die Lehrerstimme wiegt zwölfmal so viel.</w:t>
+              <w:t xml:space="preserve">3d  Rechnung und Merksatz (4 Minuten, Folie 13: Gewicht einer Stimme als maßstabsgetreue Balken): Im Klassenspiel zählt eine Lehrerstimme wie 1 Person, die Schülerstimme nur wie 1 von 12. Die Lehrerstimme wiegt zwölfmal so viel.</w:t>
             </w:r>
           </w:p>
           <w:p>
@@ -4585,7 +4585,7 @@
                 <w:sz w:val="21"/>
                 <w:szCs w:val="21"/>
               </w:rPr>
-              <w:t xml:space="preserve">„Jetzt schreibt ihr von der Folie ab: Merksatz 1. Rahmt ihn rot ein.“ (Folie 5)</w:t>
+              <w:t xml:space="preserve">„Jetzt schreibt ihr von der Folie ab: Merksatz 1. Rahmt ihn rot ein.“ (Folie 14)</w:t>
             </w:r>
           </w:p>
           <w:tbl>
@@ -4638,7 +4638,7 @@
                       <w:sz w:val="16"/>
                       <w:szCs w:val="16"/>
                     </w:rPr>
-                    <w:t xml:space="preserve">FOLIE · 5 · Merksatz 1 – abschreiben, rot umrahmen</w:t>
+                    <w:t xml:space="preserve">FOLIE · 14 · Merksatz 1 – abschreiben, rot umrahmen</w:t>
                   </w:r>
                 </w:p>
               </w:tc>
@@ -4917,7 +4917,7 @@
                 <w:sz w:val="21"/>
                 <w:szCs w:val="21"/>
               </w:rPr>
-              <w:t xml:space="preserve">Danach 1 bis 2 Sätze vorlesen lassen. Ausblick: „Was passiert, wenn der Dritte Stand nach Köpfen fordert und der König ablehnt? Das sehen wir in der nächsten Stunde.“</w:t>
+              <w:t xml:space="preserve">Folie 15. Danach 1 bis 2 Sätze vorlesen lassen. Folie 16: Lernziele prüfen (still), Ausblick: „Was passiert, wenn der Dritte Stand nach Köpfen fordert und der König ablehnt? Das sehen wir in der nächsten Stunde.“</w:t>
             </w:r>
           </w:p>
           <w:tbl>
@@ -4970,7 +4970,7 @@
                       <w:sz w:val="16"/>
                       <w:szCs w:val="16"/>
                     </w:rPr>
-                    <w:t xml:space="preserve">FOLIE · 6 · Ü2 Unfair?</w:t>
+                    <w:t xml:space="preserve">FOLIE · 15 · Ü2 Unfair?</w:t>
                   </w:r>
                 </w:p>
               </w:tc>

</xml_diff>

<commit_message>
Geschichte 8: Abstimmung 1789 als Gedankenspiel kennzeichnen (nicht nach Köpfen abgestimmt)
Co-Authored-By: Claude Sonnet 5.5 <noreply@anthropic.com>
Claude-Session: https://claude.ai/code/session_01CtRuNVyt8v9M882BKEmgNb
</commit_message>
<xml_diff>
--- a/Geschichte_8/Generalstaende_Stunde1/Tafelskript_Generalstaende_Stunde1.docx
+++ b/Geschichte_8/Generalstaende_Stunde1/Tafelskript_Generalstaende_Stunde1.docx
@@ -45,7 +45,7 @@
           <w:sz w:val="21"/>
           <w:szCs w:val="21"/>
         </w:rPr>
-        <w:t xml:space="preserve">Ziel: Die Klasse bekommt den Test zurück und reflektiert ihre Vorbereitung. Sie erarbeitet den Verlauf bis zu den Generalständen als Zeitleiste und erlebt zuerst an einem historischen Beispiel und dann in einer Mini-Abstimmung in der Schule, wie unfair die Abstimmung nach Ständen ist. Aufbau nach AVIVA. Es gibt keinen Hörtext, der Text wird gelesen. Rollen der beiden Lehrkräfte: L1 moderiert, L2 spielt in der Abstimmung den Adel und unterstützt an der Tafel.</w:t>
+        <w:t xml:space="preserve">Ziel: Die Klasse bekommt den Test zurück und reflektiert ihre Vorbereitung. Sie erarbeitet den Verlauf bis zu den Generalständen als Zeitleiste und rechnet zuerst in einem Gedankenspiel zu 1789 nach und erlebt dann in einer Mini-Abstimmung in der Schule, wie unfair die Abstimmung nach Ständen ist. Aufbau nach AVIVA. Es gibt keinen Hörtext, der Text wird gelesen. Rollen der beiden Lehrkräfte: L1 moderiert, L2 spielt in der Abstimmung den Adel und unterstützt an der Tafel.</w:t>
       </w:r>
     </w:p>
     <w:tbl>
@@ -745,7 +745,7 @@
                 <w:sz w:val="20"/>
                 <w:szCs w:val="20"/>
               </w:rPr>
-              <w:t xml:space="preserve">3  Zahlen, Abstimmung 1789, Schulbeispiel, Rechnung, Merksatz</w:t>
+              <w:t xml:space="preserve">3  Zahlen, Gedankenspiel 1789, Schulbeispiel, Rechnung, Merksatz</w:t>
             </w:r>
           </w:p>
         </w:tc>
@@ -2766,7 +2766,7 @@
           <w:sz w:val="28"/>
           <w:szCs w:val="28"/>
         </w:rPr>
-        <w:t xml:space="preserve">Abstimmung: erst 1789, dann die Schule</w:t>
+        <w:t xml:space="preserve">Abstimmung: erst Gedankenspiel 1789, dann die Schule</w:t>
       </w:r>
       <w:r>
         <w:rPr>
@@ -3920,7 +3920,7 @@
                 <w:sz w:val="21"/>
                 <w:szCs w:val="21"/>
               </w:rPr>
-              <w:t xml:space="preserve">3b  Historisches Beispiel (3 Minuten). Folie 9: Antrag „Auch Adel und Klerus zahlen künftig Steuern.“ Ergebnis auf Folie 10. Modellannahme: Klerus und Adel stimmen geschlossen mit Nein, der Dritte Stand mit Ja.</w:t>
+              <w:t xml:space="preserve">3b  Gedankenspiel zu 1789 (3 Minuten). Wichtig vorab: Nach Köpfen wurde 1789 nicht abgestimmt. Wir rechnen, was wäre, wenn. Folie 9: Antrag „Auch Adel und Klerus zahlen künftig Steuern.“ Ergebnis auf Folie 10. Modellannahme: Klerus und Adel stimmen geschlossen mit Nein, der Dritte Stand mit Ja.</w:t>
             </w:r>
           </w:p>
           <w:p>
@@ -3962,7 +3962,7 @@
                 <w:sz w:val="21"/>
                 <w:szCs w:val="21"/>
               </w:rPr>
-              <w:t xml:space="preserve">Frage: „Wie wichtig wäre die Abstimmungsregel für den Dritten Stand?“</w:t>
+              <w:t xml:space="preserve">Frage: „Wie wichtig wäre die Abstimmungsregel für den Dritten Stand?“ Dann klarstellen: Tatsächlich wurde nicht nach Köpfen abgestimmt. Adel und Klerus bestanden auf der Abstimmung nach Ständen, der Dritte Stand (Bauern und Bürger) forderte die nach Köpfen. Dieser Streit blockierte die Generalstände (Fortsetzung nach den Ferien).</w:t>
             </w:r>
           </w:p>
           <w:tbl>
@@ -4015,7 +4015,7 @@
                       <w:sz w:val="16"/>
                       <w:szCs w:val="16"/>
                     </w:rPr>
-                    <w:t xml:space="preserve">TAFEL · Mitte · Abstimmung 1789 (Modell)</w:t>
+                    <w:t xml:space="preserve">TAFEL · Mitte · Gedankenspiel 1789 (Modell)</w:t>
                   </w:r>
                 </w:p>
               </w:tc>
@@ -4042,6 +4042,20 @@
                   </w:tcMar>
                   <w:vAlign w:val="top"/>
                 </w:tcPr>
+                <w:p>
+                  <w:pPr>
+                    <w:spacing w:after="40" w:before="0"/>
+                  </w:pPr>
+                  <w:r>
+                    <w:rPr>
+                      <w:rFonts w:ascii="Cambria" w:cs="Cambria" w:eastAsia="Cambria" w:hAnsi="Cambria"/>
+                      <w:color w:val="000000"/>
+                      <w:sz w:val="20"/>
+                      <w:szCs w:val="20"/>
+                    </w:rPr>
+                    <w:t xml:space="preserve">Gedankenspiel (keine echte Abstimmung):</w:t>
+                  </w:r>
+                </w:p>
                 <w:p>
                   <w:pPr>
                     <w:spacing w:after="30" w:before="0"/>
@@ -4399,7 +4413,7 @@
                 <w:sz w:val="19"/>
                 <w:szCs w:val="19"/>
               </w:rPr>
-              <w:t xml:space="preserve">Wenn die Zeit knapp wird, entfällt 3c (das Schulbeispiel) und beginnt Stunde 2 (4 Minuten). Das historische Beispiel 3b und der Merksatz bleiben in Stunde 1. Phase 4 wird dann mündlich.</w:t>
+              <w:t xml:space="preserve">Wenn die Zeit knapp wird, entfällt 3c (das Schulbeispiel) und beginnt Stunde 2 (4 Minuten). Das Gedankenspiel 3b und der Merksatz bleiben in Stunde 1. Phase 4 wird dann mündlich.</w:t>
             </w:r>
           </w:p>
         </w:tc>

</xml_diff>

<commit_message>
Geschichte 8: Zeitstrahl umgekehrt (Daten vorgegeben, Ereignisse ergänzen)
Co-Authored-By: Claude Sonnet 5.5 <noreply@anthropic.com>
Claude-Session: https://claude.ai/code/session_01CtRuNVyt8v9M882BKEmgNb
</commit_message>
<xml_diff>
--- a/Geschichte_8/Generalstaende_Stunde1/Tafelskript_Generalstaende_Stunde1.docx
+++ b/Geschichte_8/Generalstaende_Stunde1/Tafelskript_Generalstaende_Stunde1.docx
@@ -1554,7 +1554,7 @@
           <w:sz w:val="21"/>
           <w:szCs w:val="21"/>
         </w:rPr>
-        <w:t xml:space="preserve">Material: Text „Wie kam es zu den Generalständen?“ mit Zeitstrahl unten auf demselben Blatt (ein Blatt pro Person, Datenfelder leer), Tests (verdeckt), Folien 1 bis 16 (mit Lernzielen, Ablauf nach AVIVA und Visualisierungen), Grün zum Verbessern. Vorab an der Tafel vorbereiten: Strichliste der Noten (ohne Namen) und die Erfolgsquote je Test-Aufgabe in Prozent.</w:t>
+        <w:t xml:space="preserve">Material: Text „Wie kam es zu den Generalständen?“ mit Zeitstrahl unten auf demselben Blatt (ein Blatt pro Person, Daten vorgegeben, Ereignisfelder leer), Tests (verdeckt), Folien 1 bis 16 (mit Lernzielen, Ablauf nach AVIVA und Visualisierungen), Grün zum Verbessern. Vorab an der Tafel vorbereiten: Strichliste der Noten (ohne Namen) und die Erfolgsquote je Test-Aufgabe in Prozent.</w:t>
       </w:r>
     </w:p>
     <w:p>
@@ -2186,7 +2186,7 @@
                 <w:sz w:val="21"/>
                 <w:szCs w:val="21"/>
               </w:rPr>
-              <w:t xml:space="preserve">Folie 1. Folie 6. Blatt austeilen (oben der Text, unten der Zeitstrahl mit den Ereignissen, aber leeren Datenfeldern). 5 Minuten lesen, Jahreszahlen unterstreichen, Daten im Zeitstrahl eintragen.</w:t>
+              <w:t xml:space="preserve">Folie 1. Folie 6. Blatt austeilen (oben der Text, unten der Zeitstrahl mit den Daten, aber leeren Ereignisfeldern). 5 Minuten lesen, Jahreszahlen unterstreichen, zu jedem Datum das Ereignis als Stichwort eintragen.</w:t>
             </w:r>
           </w:p>
           <w:tbl>
@@ -2307,7 +2307,7 @@
                       <w:sz w:val="20"/>
                       <w:szCs w:val="20"/>
                     </w:rPr>
-                    <w:t xml:space="preserve">2. Trage die Daten in den Zeitstrahl ein.</w:t>
+                    <w:t xml:space="preserve">2. Schreibe zu jedem Datum das Ereignis in den Zeitstrahl.</w:t>
                   </w:r>
                 </w:p>
                 <w:p>
@@ -2321,7 +2321,7 @@
                       <w:sz w:val="20"/>
                       <w:szCs w:val="20"/>
                     </w:rPr>
-                    <w:t xml:space="preserve">3. Prüfe: Passt jedes Datum zum Ereignis?</w:t>
+                    <w:t xml:space="preserve">3. Prüfe: Passt jedes Ereignis zum Datum?</w:t>
                   </w:r>
                 </w:p>
                 <w:p>
@@ -2518,7 +2518,7 @@
                 <w:sz w:val="21"/>
                 <w:szCs w:val="21"/>
               </w:rPr>
-              <w:t xml:space="preserve">Folie 7 (Zeitstrahl als Bild) erst zeigen, wenn die Klasse die Daten genannt hat. Kontrolle des Zeitstrahls, 5 Minuten. Pro Ereignis nennt ein Schüler oder eine Schülerin das Datum, ein Schüler oder eine Schülerin schreibt es an die Tafel (Stichwort daneben). Leitfrage danach:</w:t>
+              <w:t xml:space="preserve">Folie 7 (Zeitstrahl als Bild) erst zeigen, wenn die Klasse die Ereignisse genannt hat. Kontrolle des Zeitstrahls, 5 Minuten. Pro Datum nennt ein Schüler oder eine Schülerin das Ereignis, ein Schüler oder eine Schülerin schreibt es an die Tafel (Datum vorgegeben). Leitfrage danach:</w:t>
             </w:r>
           </w:p>
           <w:tbl>
@@ -2735,7 +2735,7 @@
                 <w:sz w:val="19"/>
                 <w:szCs w:val="19"/>
               </w:rPr>
-              <w:t xml:space="preserve">Leitfrage: „Warum ruft der König die Generalstände ein, obwohl er sie 175 Jahre nicht brauchte?“ Antwort: Er braucht Geld, die Privilegierten blockieren Reformen, dazu kommen Hunger und drohender Bankrott. Danach „Vergleicht und verbessert mit Grün.“ Das Abschreiben entfällt, weil die Daten schon im Zeitstrahl stehen. Die gewonnene Zeit (2 Minuten) geht in den Puffer.</w:t>
+              <w:t xml:space="preserve">Leitfrage: „Warum ruft der König die Generalstände ein, obwohl er sie 175 Jahre nicht brauchte?“ Antwort: Er braucht Geld, die Privilegierten blockieren Reformen, dazu kommen Hunger und drohender Bankrott. Danach „Vergleicht und verbessert mit Grün.“ Das Abschreiben entfällt, weil die Schüler die Ereignisse schon im Zeitstrahl notiert haben. Die gewonnene Zeit (2 Minuten) geht in den Puffer.</w:t>
             </w:r>
           </w:p>
         </w:tc>
@@ -5397,7 +5397,7 @@
                 <w:sz w:val="20"/>
                 <w:szCs w:val="20"/>
               </w:rPr>
-              <w:t xml:space="preserve">Blatt eingeklebt, Daten eingetragen (1614 bis 5. Mai 1789), Verbesserungen grün</w:t>
+              <w:t xml:space="preserve">Blatt eingeklebt, Ereignisse zu den Daten eingetragen (1614 bis 5. Mai 1789), Verbesserungen grün</w:t>
             </w:r>
           </w:p>
         </w:tc>

</xml_diff>